<commit_message>
fix(classDiagram): fix class diagram sync with conceptual
</commit_message>
<xml_diff>
--- a/LegacyReport.docx
+++ b/LegacyReport.docx
@@ -1017,7 +1017,61 @@
             <w:rPr>
               <w:sz w:val="22"/>
             </w:rPr>
-            <w:t>28</w:t>
+            <w:t>29</w:t>
+          </w:r>
+        </w:p>
+        <w:p>
+          <w:pPr>
+            <w:pStyle w:val="18"/>
+            <w:tabs>
+              <w:tab w:val="right" w:leader="dot" w:pos="9350"/>
+            </w:tabs>
+            <w:spacing w:before="0" w:after="20" w:line="240" w:lineRule="auto"/>
+          </w:pPr>
+          <w:r>
+            <w:rPr>
+              <w:sz w:val="22"/>
+            </w:rPr>
+            <w:t>IV.3.1 Domain Class Diagram</w:t>
+          </w:r>
+          <w:r>
+            <w:rPr>
+              <w:sz w:val="22"/>
+            </w:rPr>
+            <w:tab/>
+          </w:r>
+          <w:r>
+            <w:rPr>
+              <w:sz w:val="22"/>
+            </w:rPr>
+            <w:t>29</w:t>
+          </w:r>
+        </w:p>
+        <w:p>
+          <w:pPr>
+            <w:pStyle w:val="18"/>
+            <w:tabs>
+              <w:tab w:val="right" w:leader="dot" w:pos="9350"/>
+            </w:tabs>
+            <w:spacing w:before="0" w:after="20" w:line="240" w:lineRule="auto"/>
+          </w:pPr>
+          <w:r>
+            <w:rPr>
+              <w:sz w:val="22"/>
+            </w:rPr>
+            <w:t>IV.3.2 Service and Repository Layers</w:t>
+          </w:r>
+          <w:r>
+            <w:rPr>
+              <w:sz w:val="22"/>
+            </w:rPr>
+            <w:tab/>
+          </w:r>
+          <w:r>
+            <w:rPr>
+              <w:sz w:val="22"/>
+            </w:rPr>
+            <w:t>30</w:t>
           </w:r>
         </w:p>
         <w:p>
@@ -1044,7 +1098,7 @@
             <w:rPr>
               <w:sz w:val="22"/>
             </w:rPr>
-            <w:t>30</w:t>
+            <w:t>31</w:t>
           </w:r>
         </w:p>
         <w:p>
@@ -1071,7 +1125,7 @@
             <w:rPr>
               <w:sz w:val="22"/>
             </w:rPr>
-            <w:t>30</w:t>
+            <w:t>31</w:t>
           </w:r>
         </w:p>
         <w:p>
@@ -1098,7 +1152,7 @@
             <w:rPr>
               <w:sz w:val="22"/>
             </w:rPr>
-            <w:t>31</w:t>
+            <w:t>32</w:t>
           </w:r>
           <w:r>
             <w:fldChar w:fldCharType="end"/>
@@ -20709,24 +20763,21 @@
       </w:pPr>
       <w:r>
         <w:drawing>
-          <wp:inline distT="0" distB="0" distL="114300" distR="114300">
-            <wp:extent cx="9235440" cy="845185"/>
-            <wp:effectExtent l="0" t="0" r="0" b="8255"/>
-            <wp:docPr id="7" name="Picture 7"/>
+          <wp:inline xmlns:a="http://schemas.openxmlformats.org/drawingml/2006/main" xmlns:pic="http://schemas.openxmlformats.org/drawingml/2006/picture">
+            <wp:extent cx="9235440" cy="2516157"/>
+            <wp:docPr id="15" name="Picture 15"/>
             <wp:cNvGraphicFramePr>
-              <a:graphicFrameLocks xmlns:a="http://schemas.openxmlformats.org/drawingml/2006/main" noChangeAspect="1"/>
+              <a:graphicFrameLocks noChangeAspect="1"/>
             </wp:cNvGraphicFramePr>
-            <a:graphic xmlns:a="http://schemas.openxmlformats.org/drawingml/2006/main">
+            <a:graphic>
               <a:graphicData uri="http://schemas.openxmlformats.org/drawingml/2006/picture">
-                <pic:pic xmlns:pic="http://schemas.openxmlformats.org/drawingml/2006/picture">
+                <pic:pic>
                   <pic:nvPicPr>
-                    <pic:cNvPr id="7" name="Picture 7"/>
-                    <pic:cNvPicPr>
-                      <a:picLocks noChangeAspect="1"/>
-                    </pic:cNvPicPr>
+                    <pic:cNvPr id="0" name="comm.png"/>
+                    <pic:cNvPicPr/>
                   </pic:nvPicPr>
                   <pic:blipFill>
-                    <a:blip r:embed="rId12"/>
+                    <a:blip r:embed="rId22"/>
                     <a:stretch>
                       <a:fillRect/>
                     </a:stretch>
@@ -20734,11 +20785,9 @@
                   <pic:spPr>
                     <a:xfrm>
                       <a:off x="0" y="0"/>
-                      <a:ext cx="9235440" cy="845467"/>
+                      <a:ext cx="9235440" cy="2516157"/>
                     </a:xfrm>
-                    <a:prstGeom prst="rect">
-                      <a:avLst/>
-                    </a:prstGeom>
+                    <a:prstGeom prst="rect"/>
                   </pic:spPr>
                 </pic:pic>
               </a:graphicData>
@@ -22902,6 +22951,16 @@
     </w:p>
     <w:p>
       <w:pPr>
+        <w:pStyle w:val="5"/>
+        <w:keepNext/>
+      </w:pPr>
+      <w:r>
+        <w:t xml:space="preserve">IV.3.1 Domain Class Diagram</w:t>
+      </w:r>
+    </w:p>
+    <w:p>
+      <w:pPr>
+        <w:keepNext/>
         <w:jc w:val="both"/>
       </w:pPr>
       <w:r>
@@ -22980,6 +23039,76 @@
     </w:p>
     <w:p>
       <w:pPr>
+        <w:pStyle w:val="5"/>
+        <w:keepNext/>
+      </w:pPr>
+      <w:r>
+        <w:t xml:space="preserve">IV.3.2 Service and Repository Layers</w:t>
+      </w:r>
+    </w:p>
+    <w:p>
+      <w:pPr>
+        <w:keepNext/>
+        <w:jc w:val="both"/>
+      </w:pPr>
+      <w:r>
+        <w:t xml:space="preserve">The layered class diagram shows how the business logic is separated from data access. The Business layer contains four service classes (stereotype «control»): VaultService manages assets, legal documents, beneficiaries and the executor; DeadManSwitchService configures the switch, records check-ins and triggers the handover; LegalVerificationService submits, approves or rejects the verification request and unlocks the vault; HandoverService creates the assignment of each asset, delivers it and tracks the handover progress. Each service depends only on a repository interface (dashed arrow «uses»), and each interface is realized by an Impl class that accesses the database through a DbContext (dashed arrow with a hollow triangle «implements»). The services therefore never depend on the Impl classes, so the database technology can be replaced by writing a new Impl class without changing the business layer.</w:t>
+      </w:r>
+    </w:p>
+    <w:p>
+      <w:pPr>
+        <w:keepNext/>
+        <w:jc w:val="center"/>
+      </w:pPr>
+      <w:r>
+        <w:drawing>
+          <wp:inline xmlns:a="http://schemas.openxmlformats.org/drawingml/2006/main" xmlns:pic="http://schemas.openxmlformats.org/drawingml/2006/picture">
+            <wp:extent cx="9235440" cy="3783192"/>
+            <wp:docPr id="16" name="Picture 16"/>
+            <wp:cNvGraphicFramePr>
+              <a:graphicFrameLocks noChangeAspect="1"/>
+            </wp:cNvGraphicFramePr>
+            <a:graphic>
+              <a:graphicData uri="http://schemas.openxmlformats.org/drawingml/2006/picture">
+                <pic:pic>
+                  <pic:nvPicPr>
+                    <pic:cNvPr id="0" name="layers.png"/>
+                    <pic:cNvPicPr/>
+                  </pic:nvPicPr>
+                  <pic:blipFill>
+                    <a:blip r:embed="rId23"/>
+                    <a:stretch>
+                      <a:fillRect/>
+                    </a:stretch>
+                  </pic:blipFill>
+                  <pic:spPr>
+                    <a:xfrm>
+                      <a:off x="0" y="0"/>
+                      <a:ext cx="9235440" cy="3783192"/>
+                    </a:xfrm>
+                    <a:prstGeom prst="rect"/>
+                  </pic:spPr>
+                </pic:pic>
+              </a:graphicData>
+            </a:graphic>
+          </wp:inline>
+        </w:drawing>
+      </w:r>
+    </w:p>
+    <w:p>
+      <w:pPr>
+        <w:pStyle w:val="10"/>
+        <w:jc w:val="center"/>
+      </w:pPr>
+      <w:r>
+        <w:rPr>
+          <w:i/>
+        </w:rPr>
+        <w:t xml:space="preserve">Figure 12. Service and Repository Layers Class Diagram of LegacyVault</w:t>
+      </w:r>
+    </w:p>
+    <w:p>
+      <w:pPr>
         <w:pStyle w:val="3"/>
         <w:keepNext/>
       </w:pPr>
@@ -23050,7 +23179,7 @@
         <w:rPr>
           <w:i/>
         </w:rPr>
-        <w:t>Figure 12. Conceptual Diagram of LegacyVault</w:t>
+        <w:t xml:space="preserve">Figure 13. Conceptual Diagram of LegacyVault</w:t>
       </w:r>
     </w:p>
     <w:p>
@@ -23126,7 +23255,7 @@
         <w:rPr>
           <w:i/>
         </w:rPr>
-        <w:t>Figure 13. Logical Database Diagram of LegacyVault</w:t>
+        <w:t xml:space="preserve">Figure 14. Logical Database Diagram of LegacyVault</w:t>
       </w:r>
     </w:p>
     <w:sectPr>

</xml_diff>

<commit_message>
fix(classDiagram, docs): fix class diagram and final docs
</commit_message>
<xml_diff>
--- a/LegacyReport.docx
+++ b/LegacyReport.docx
@@ -5986,7 +5986,7 @@
       <w:r>
         <w:drawing>
           <wp:inline distT="0" distB="0" distL="114300" distR="114300">
-            <wp:extent cx="5668645" cy="5732780"/>
+            <wp:extent cx="5668645" cy="4034226"/>
             <wp:effectExtent l="0" t="0" r="635" b="12700"/>
             <wp:docPr id="3" name="Picture 3"/>
             <wp:cNvGraphicFramePr>
@@ -6010,7 +6010,7 @@
                   <pic:spPr>
                     <a:xfrm>
                       <a:off x="0" y="0"/>
-                      <a:ext cx="5669279" cy="5733153"/>
+                      <a:ext cx="5668645" cy="4034226"/>
                     </a:xfrm>
                     <a:prstGeom prst="rect">
                       <a:avLst/>
@@ -20586,7 +20586,7 @@
         <w:jc w:val="both"/>
       </w:pPr>
       <w:r>
-        <w:t>The entity relationship diagram is presented as the Conceptual Diagram of LegacyVault. It contains 19 entities; each arrow between entities corresponds to one of the 23 requirements of the specification.</w:t>
+        <w:t>The entity relationship diagram is presented as the Conceptual Diagram of LegacyVault. It contains 20 entities and 28 relationships; each relationship is drawn with its cardinality (exactly one, zero or one, zero or many, one or many).</w:t>
       </w:r>
     </w:p>
     <w:p>
@@ -20597,7 +20597,7 @@
       <w:r>
         <w:drawing>
           <wp:inline distT="0" distB="0" distL="114300" distR="114300">
-            <wp:extent cx="7292340" cy="4937760"/>
+            <wp:extent cx="8016743" cy="4950000"/>
             <wp:effectExtent l="0" t="0" r="7620" b="0"/>
             <wp:docPr id="5" name="Picture 5"/>
             <wp:cNvGraphicFramePr>
@@ -20621,7 +20621,7 @@
                   <pic:spPr>
                     <a:xfrm>
                       <a:off x="0" y="0"/>
-                      <a:ext cx="7292875" cy="4937760"/>
+                      <a:ext cx="8016743" cy="4950000"/>
                     </a:xfrm>
                     <a:prstGeom prst="rect">
                       <a:avLst/>
@@ -20681,7 +20681,7 @@
       <w:r>
         <w:drawing>
           <wp:inline distT="0" distB="0" distL="114300" distR="114300">
-            <wp:extent cx="5568315" cy="4846320"/>
+            <wp:extent cx="4751772" cy="4900000"/>
             <wp:effectExtent l="0" t="0" r="9525" b="0"/>
             <wp:docPr id="6" name="Picture 6"/>
             <wp:cNvGraphicFramePr>
@@ -20705,7 +20705,7 @@
                   <pic:spPr>
                     <a:xfrm>
                       <a:off x="0" y="0"/>
-                      <a:ext cx="5568552" cy="4846320"/>
+                      <a:ext cx="4751772" cy="4900000"/>
                     </a:xfrm>
                     <a:prstGeom prst="rect">
                       <a:avLst/>
@@ -21664,7 +21664,7 @@
       <w:r>
         <w:drawing>
           <wp:inline distT="0" distB="0" distL="114300" distR="114300">
-            <wp:extent cx="9235440" cy="2863850"/>
+            <wp:extent cx="9235440" cy="3030742"/>
             <wp:effectExtent l="0" t="0" r="0" b="1270"/>
             <wp:docPr id="9" name="Picture 9"/>
             <wp:cNvGraphicFramePr>
@@ -21688,7 +21688,7 @@
                   <pic:spPr>
                     <a:xfrm>
                       <a:off x="0" y="0"/>
-                      <a:ext cx="9235440" cy="2864003"/>
+                      <a:ext cx="9235440" cy="3030742"/>
                     </a:xfrm>
                     <a:prstGeom prst="rect">
                       <a:avLst/>
@@ -22942,6 +22942,19 @@
     <w:p/>
     <w:p>
       <w:pPr>
+        <w:spacing w:before="0" w:after="0" w:line="20" w:lineRule="exact"/>
+        <w:sectPr>
+          <w:pgSz w:w="11906" w:h="16838"/>
+          <w:pgMar w:top="1440" w:right="1416" w:bottom="1440" w:left="1440" w:header="0" w:footer="0" w:gutter="0"/>
+          <w:pgNumType w:fmt="decimal"/>
+          <w:cols w:space="720" w:num="1"/>
+          <w:formProt w:val="0"/>
+          <w:docGrid w:linePitch="360" w:charSpace="0"/>
+        </w:sectPr>
+      </w:pPr>
+    </w:p>
+    <w:p>
+      <w:pPr>
         <w:pStyle w:val="3"/>
         <w:keepNext/>
       </w:pPr>
@@ -22964,7 +22977,7 @@
         <w:jc w:val="both"/>
       </w:pPr>
       <w:r>
-        <w:t>The class diagram contains 22 classes. Person is the parent of the five actors (VaultOwner, DigitalExecutor, Beneficiary, LegalVerifier, SystemAdministrator). Vault is the aggregate root: it contains asset groups, digital assets, legal documents and one DeadManSwitch. Handover is modelled by ExecutorAppointment, BeneficiaryAssignment, HandoverCase and LegalVerificationRequest with its VerificationMessage. Role and Permission support RBAC; AuditLog, SystemPolicy and IntegrationConfig support monitoring and administration.</w:t>
+        <w:t>The class diagram contains 20 classes, the same classes as the Conceptual Diagram. User represents every person of the system (Vault Owner, Digital Executor, Beneficiary, Legal Verifier and System Administrator); the permissions of each person come from Role and Permission (RBAC). Vault is the aggregate root: it contains digital assets, legal documents and one DeadManSwitch, which records CheckIn and takes its default values from SystemPolicy. Handover is modelled by ExecutorAppointment, LegalVerificationRequest with its VerificationMessage, HandoverCase with its HandoverItem, and BeneficiaryAssignment with its IdentityVerification. Notification, AuditLog, SystemPolicy and IntegrationConfig support notification, monitoring and administration.</w:t>
       </w:r>
     </w:p>
     <w:p>
@@ -22975,7 +22988,7 @@
       <w:r>
         <w:drawing>
           <wp:inline distT="0" distB="0" distL="114300" distR="114300">
-            <wp:extent cx="5669280" cy="6027420"/>
+            <wp:extent cx="8739732" cy="4500000"/>
             <wp:effectExtent l="0" t="0" r="0" b="7620"/>
             <wp:docPr id="12" name="Picture 12"/>
             <wp:cNvGraphicFramePr>
@@ -22999,7 +23012,7 @@
                   <pic:spPr>
                     <a:xfrm>
                       <a:off x="0" y="0"/>
-                      <a:ext cx="5669280" cy="6027474"/>
+                      <a:ext cx="8739732" cy="4500000"/>
                     </a:xfrm>
                     <a:prstGeom prst="rect">
                       <a:avLst/>
@@ -23028,8 +23041,8 @@
       <w:pPr>
         <w:spacing w:before="0" w:after="0" w:line="20" w:lineRule="exact"/>
         <w:sectPr>
-          <w:pgSz w:w="11906" w:h="16838"/>
-          <w:pgMar w:top="1440" w:right="1416" w:bottom="1440" w:left="1440" w:header="0" w:footer="0" w:gutter="0"/>
+          <w:pgSz w:w="16838" w:h="11906" w:orient="landscape"/>
+          <w:pgMar w:top="900" w:right="1000" w:bottom="900" w:left="1000" w:header="0" w:footer="0" w:gutter="0"/>
           <w:pgNumType w:fmt="decimal"/>
           <w:cols w:space="720" w:num="1"/>
           <w:formProt w:val="0"/>
@@ -23133,7 +23146,7 @@
       <w:r>
         <w:drawing>
           <wp:inline distT="0" distB="0" distL="114300" distR="114300">
-            <wp:extent cx="7562850" cy="5120640"/>
+            <wp:extent cx="8016743" cy="4950000"/>
             <wp:effectExtent l="0" t="0" r="11430" b="0"/>
             <wp:docPr id="13" name="Picture 13"/>
             <wp:cNvGraphicFramePr>
@@ -23157,7 +23170,7 @@
                   <pic:spPr>
                     <a:xfrm>
                       <a:off x="0" y="0"/>
-                      <a:ext cx="7562982" cy="5120640"/>
+                      <a:ext cx="8016743" cy="4950000"/>
                     </a:xfrm>
                     <a:prstGeom prst="rect">
                       <a:avLst/>

</xml_diff>

<commit_message>
chore(docs): update documentation and reports
Update documentation and reports
</commit_message>
<xml_diff>
--- a/LegacyReport.docx
+++ b/LegacyReport.docx
@@ -78,12 +78,10 @@
       <w:pPr>
         <w:jc w:val="center"/>
         <w:rPr>
-          <w:rFonts w:hint="default"/>
           <w:b/>
           <w:caps/>
           <w:color w:val="C00000"/>
           <w:sz w:val="48"/>
-          <w:lang w:val="vi-VN"/>
         </w:rPr>
       </w:pPr>
       <w:r>
@@ -91,15 +89,7 @@
           <w:rStyle w:val="24"/>
           <w:rFonts w:eastAsiaTheme="majorEastAsia"/>
         </w:rPr>
-        <w:t>Subject: SWD39</w:t>
-      </w:r>
-      <w:r>
-        <w:rPr>
-          <w:rStyle w:val="24"/>
-          <w:rFonts w:hint="default" w:ascii="TimesNewRomanPS-BoldMT" w:eastAsiaTheme="majorEastAsia"/>
-          <w:lang w:val="vi-VN"/>
-        </w:rPr>
-        <w:t>2</w:t>
+        <w:t>Subject: SWD391</w:t>
       </w:r>
     </w:p>
     <w:p>
@@ -124,6 +114,8 @@
       <w:pPr>
         <w:pStyle w:val="38"/>
       </w:pPr>
+      <w:bookmarkStart w:id="0" w:name="_GoBack"/>
+      <w:bookmarkEnd w:id="0"/>
     </w:p>
     <w:p>
       <w:pPr>
@@ -1888,23 +1880,36 @@
         <w:rPr>
           <w:b/>
         </w:rPr>
-        <w:t>Group name:</w:t>
+        <w:t xml:space="preserve">Project code: </w:t>
       </w:r>
       <w:r>
         <w:rPr>
-          <w:rFonts w:hint="default"/>
+          <w:highlight w:val="yellow"/>
+        </w:rPr>
+        <w:t>[to be confirmed]</w:t>
+      </w:r>
+    </w:p>
+    <w:p>
+      <w:pPr>
+        <w:pStyle w:val="27"/>
+        <w:numPr>
+          <w:ilvl w:val="0"/>
+          <w:numId w:val="1"/>
+        </w:numPr>
+        <w:ind w:left="706" w:hanging="360"/>
+        <w:jc w:val="both"/>
+      </w:pPr>
+      <w:r>
+        <w:rPr>
           <w:b/>
-          <w:lang w:val="vi-VN"/>
         </w:rPr>
-        <w:t xml:space="preserve"> </w:t>
+        <w:t xml:space="preserve">Group name: </w:t>
       </w:r>
       <w:r>
         <w:rPr>
-          <w:rFonts w:hint="default"/>
-          <w:b/>
-          <w:lang w:val="en-US"/>
+          <w:highlight w:val="yellow"/>
         </w:rPr>
-        <w:t>Group 2</w:t>
+        <w:t>[to be confirmed]</w:t>
       </w:r>
     </w:p>
     <w:p>
@@ -5981,7 +5986,7 @@
       <w:r>
         <w:drawing>
           <wp:inline distT="0" distB="0" distL="114300" distR="114300">
-            <wp:extent cx="5668645" cy="4034155"/>
+            <wp:extent cx="5668645" cy="4034226"/>
             <wp:effectExtent l="0" t="0" r="635" b="12700"/>
             <wp:docPr id="3" name="Picture 3"/>
             <wp:cNvGraphicFramePr>
@@ -20592,7 +20597,7 @@
       <w:r>
         <w:drawing>
           <wp:inline distT="0" distB="0" distL="114300" distR="114300">
-            <wp:extent cx="7027545" cy="4949825"/>
+            <wp:extent cx="7028159" cy="4950000"/>
             <wp:effectExtent l="0" t="0" r="7620" b="0"/>
             <wp:docPr id="5" name="Picture 5"/>
             <wp:cNvGraphicFramePr>
@@ -20676,7 +20681,7 @@
       <w:r>
         <w:drawing>
           <wp:inline distT="0" distB="0" distL="114300" distR="114300">
-            <wp:extent cx="4751705" cy="4899660"/>
+            <wp:extent cx="4751772" cy="4900000"/>
             <wp:effectExtent l="0" t="0" r="9525" b="0"/>
             <wp:docPr id="6" name="Picture 6"/>
             <wp:cNvGraphicFramePr>
@@ -20748,7 +20753,7 @@
         <w:jc w:val="both"/>
       </w:pPr>
       <w:r>
-        <w:t>The communication diagram shows the objects that take part in the handover and the links between them. Objects are drawn as rectangles (the underlined names are objects, the «actor» boxes are the people who use the system), a link is a plain line between two objects that can send messages to each other, and a message is an arrow that points from the sender to the receiver and carries a sequence number. Messages are numbered in the order they are sent: the Dead Man's Switch notifies the Digital Executor (1), the executor submits the death certificate to the Legal Verification Request (2), the request saves itself with status PENDING (2.1), the request is sent to the Legal Verifier (3) who checks the digital signature (3.1) and approves and e-signs it (4), the vault is unlocked (5) and sets its status to UNLOCKED (5.1), an assignment is created for each asset (6), the Beneficiary is notified (7) and confirms receipt (8), and the handover progress is sent back to the executor (9). A number with a decimal part, such as 2.1, is a nested message: it is sent while the object is handling the message with the parent number, and a message an object sends to itself is drawn as a loop.</w:t>
+        <w:t>The communication diagram shows the objects that take part in the handover and the links between them. Messages are numbered in the order they are sent: the Dead Man's Switch notifies the Digital Executor (1), the executor submits the death certificate to the Legal Verification Request (2), the request is sent to the Legal Verifier (3) who approves and e-signs it (4), the vault is unlocked (5), an assignment is created for each asset (6), the Beneficiary is notified (7) and confirms receipt (8), and the handover progress is sent back to the executor (9).</w:t>
       </w:r>
     </w:p>
     <w:p>
@@ -20758,24 +20763,21 @@
       </w:pPr>
       <w:r>
         <w:drawing>
-          <wp:inline distT="0" distB="0" distL="114300" distR="114300">
-            <wp:extent cx="9235440" cy="2981087"/>
-            <wp:effectExtent l="0" t="0" r="0" b="13970"/>
+          <wp:inline xmlns:a="http://schemas.openxmlformats.org/drawingml/2006/main" xmlns:pic="http://schemas.openxmlformats.org/drawingml/2006/picture">
+            <wp:extent cx="9235440" cy="2516157"/>
             <wp:docPr id="15" name="Picture 15"/>
             <wp:cNvGraphicFramePr>
-              <a:graphicFrameLocks xmlns:a="http://schemas.openxmlformats.org/drawingml/2006/main" noChangeAspect="1"/>
+              <a:graphicFrameLocks noChangeAspect="1"/>
             </wp:cNvGraphicFramePr>
-            <a:graphic xmlns:a="http://schemas.openxmlformats.org/drawingml/2006/main">
+            <a:graphic>
               <a:graphicData uri="http://schemas.openxmlformats.org/drawingml/2006/picture">
-                <pic:pic xmlns:pic="http://schemas.openxmlformats.org/drawingml/2006/picture">
+                <pic:pic>
                   <pic:nvPicPr>
-                    <pic:cNvPr id="15" name="Picture 15"/>
-                    <pic:cNvPicPr>
-                      <a:picLocks noChangeAspect="1"/>
-                    </pic:cNvPicPr>
+                    <pic:cNvPr id="0" name="comm.png"/>
+                    <pic:cNvPicPr/>
                   </pic:nvPicPr>
                   <pic:blipFill>
-                    <a:blip r:embed="rId12"/>
+                    <a:blip r:embed="rId22"/>
                     <a:stretch>
                       <a:fillRect/>
                     </a:stretch>
@@ -20783,11 +20785,9 @@
                   <pic:spPr>
                     <a:xfrm>
                       <a:off x="0" y="0"/>
-                      <a:ext cx="9235440" cy="2981087"/>
+                      <a:ext cx="9235440" cy="2516157"/>
                     </a:xfrm>
-                    <a:prstGeom prst="rect">
-                      <a:avLst/>
-                    </a:prstGeom>
+                    <a:prstGeom prst="rect"/>
                   </pic:spPr>
                 </pic:pic>
               </a:graphicData>
@@ -21664,7 +21664,7 @@
       <w:r>
         <w:drawing>
           <wp:inline distT="0" distB="0" distL="114300" distR="114300">
-            <wp:extent cx="9235440" cy="3030220"/>
+            <wp:extent cx="9235440" cy="3030742"/>
             <wp:effectExtent l="0" t="0" r="0" b="1270"/>
             <wp:docPr id="9" name="Picture 9"/>
             <wp:cNvGraphicFramePr>
@@ -21748,7 +21748,7 @@
       <w:r>
         <w:drawing>
           <wp:inline distT="0" distB="0" distL="114300" distR="114300">
-            <wp:extent cx="7532370" cy="4599940"/>
+            <wp:extent cx="7532630" cy="4600000"/>
             <wp:effectExtent l="0" t="0" r="0" b="5080"/>
             <wp:docPr id="10" name="Picture 10"/>
             <wp:cNvGraphicFramePr>
@@ -22968,7 +22968,7 @@
         <w:keepNext/>
       </w:pPr>
       <w:r>
-        <w:t>IV.3.1 Domain Class Diagram</w:t>
+        <w:t xml:space="preserve">IV.3.1 Domain Class Diagram</w:t>
       </w:r>
     </w:p>
     <w:p>
@@ -22977,7 +22977,7 @@
         <w:jc w:val="both"/>
       </w:pPr>
       <w:r>
-        <w:t>The class diagram contains 24 classes, the same classes as the Conceptual Diagram. User is the generalization (parent) class and holds the common account data (login, logout, OTP). Every role is a subclass that inherits from User through a generalization relationship (VaultOwner, DigitalExecutor, Beneficiary, LegalVerifier and SystemAdministrator) and adds the operations of that role. SystemAdministrator also manages the Permissions and the IntegrationConfig. Vault is the aggregate root: it contains digital assets, legal documents and one DeadManSwitch, which records CheckIn and takes its default values from SystemPolicy. Handover is modelled by ExecutorAppointment, LegalVerificationRequest with its VerificationMessage, HandoverCase with its HandoverItem, and BeneficiaryAssignment with its IdentityVerification. Notification, AuditLog, SystemPolicy and IntegrationConfig support notification, monitoring and administration.</w:t>
+        <w:t>The class diagram contains 24 classes, the same classes as the Conceptual Diagram. User holds the common account data (login, logout, OTP); every role is a profile class linked to the user with a 1 to 0..1 association (VaultOwner, DigitalExecutor, Beneficiary, LegalVerifier and SystemAdministrator) and carries the operations of that role. SystemAdministrator also manages the Permissions and the IntegrationConfig. Vault is the aggregate root: it contains digital assets, legal documents and one DeadManSwitch, which records CheckIn and takes its default values from SystemPolicy. Handover is modelled by ExecutorAppointment, LegalVerificationRequest with its VerificationMessage, HandoverCase with its HandoverItem, and BeneficiaryAssignment with its IdentityVerification. Notification, AuditLog, SystemPolicy and IntegrationConfig support notification, monitoring and administration.</w:t>
       </w:r>
     </w:p>
     <w:p>
@@ -22988,7 +22988,7 @@
       <w:r>
         <w:drawing>
           <wp:inline distT="0" distB="0" distL="114300" distR="114300">
-            <wp:extent cx="6374760" cy="4500000"/>
+            <wp:extent cx="6394125" cy="4500000"/>
             <wp:effectExtent l="0" t="0" r="0" b="7620"/>
             <wp:docPr id="12" name="Picture 12"/>
             <wp:cNvGraphicFramePr>
@@ -23012,7 +23012,7 @@
                   <pic:spPr>
                     <a:xfrm>
                       <a:off x="0" y="0"/>
-                      <a:ext cx="6374760" cy="4500000"/>
+                      <a:ext cx="6394125" cy="4500000"/>
                     </a:xfrm>
                     <a:prstGeom prst="rect">
                       <a:avLst/>
@@ -23056,7 +23056,7 @@
         <w:keepNext/>
       </w:pPr>
       <w:r>
-        <w:t>IV.3.2 Service and Repository Layers</w:t>
+        <w:t xml:space="preserve">IV.3.2 Service and Repository Layers</w:t>
       </w:r>
     </w:p>
     <w:p>
@@ -23065,7 +23065,7 @@
         <w:jc w:val="both"/>
       </w:pPr>
       <w:r>
-        <w:t>The layered class diagram shows how the business logic is separated from data access. The Business layer contains four service classes (stereotype «control»): VaultService manages assets, legal documents, beneficiaries and the executor; DeadManSwitchService configures the switch, records check-ins and triggers the handover; LegalVerificationService submits, approves or rejects the verification request and unlocks the vault; HandoverService creates the assignment of each asset, delivers it and tracks the handover progress. Each service depends only on a repository interface (dashed arrow «uses»), and each interface is realized by an Impl class that accesses the database through a DbContext (dashed arrow with a hollow triangle «implements»). The services therefore never depend on the Impl classes, so the database technology can be replaced by writing a new Impl class without changing the business layer.</w:t>
+        <w:t xml:space="preserve">The layered class diagram shows how the business logic is separated from data access. The Business layer contains four service classes (stereotype «control»): VaultService manages assets, legal documents, beneficiaries and the executor; DeadManSwitchService configures the switch, records check-ins and triggers the handover; LegalVerificationService submits, approves or rejects the verification request and unlocks the vault; HandoverService creates the assignment of each asset, delivers it and tracks the handover progress. Each service depends only on a repository interface (dashed arrow «uses»), and each interface is realized by an Impl class that accesses the database through a DbContext (dashed arrow with a hollow triangle «implements»). The services therefore never depend on the Impl classes, so the database technology can be replaced by writing a new Impl class without changing the business layer.</w:t>
       </w:r>
     </w:p>
     <w:p>
@@ -23075,24 +23075,21 @@
       </w:pPr>
       <w:r>
         <w:drawing>
-          <wp:inline distT="0" distB="0" distL="114300" distR="114300">
-            <wp:extent cx="9235440" cy="3782695"/>
-            <wp:effectExtent l="0" t="0" r="0" b="12065"/>
+          <wp:inline xmlns:a="http://schemas.openxmlformats.org/drawingml/2006/main" xmlns:pic="http://schemas.openxmlformats.org/drawingml/2006/picture">
+            <wp:extent cx="9235440" cy="3783192"/>
             <wp:docPr id="16" name="Picture 16"/>
             <wp:cNvGraphicFramePr>
-              <a:graphicFrameLocks xmlns:a="http://schemas.openxmlformats.org/drawingml/2006/main" noChangeAspect="1"/>
+              <a:graphicFrameLocks noChangeAspect="1"/>
             </wp:cNvGraphicFramePr>
-            <a:graphic xmlns:a="http://schemas.openxmlformats.org/drawingml/2006/main">
+            <a:graphic>
               <a:graphicData uri="http://schemas.openxmlformats.org/drawingml/2006/picture">
-                <pic:pic xmlns:pic="http://schemas.openxmlformats.org/drawingml/2006/picture">
+                <pic:pic>
                   <pic:nvPicPr>
-                    <pic:cNvPr id="16" name="Picture 16"/>
-                    <pic:cNvPicPr>
-                      <a:picLocks noChangeAspect="1"/>
-                    </pic:cNvPicPr>
+                    <pic:cNvPr id="0" name="layers.png"/>
+                    <pic:cNvPicPr/>
                   </pic:nvPicPr>
                   <pic:blipFill>
-                    <a:blip r:embed="rId18"/>
+                    <a:blip r:embed="rId23"/>
                     <a:stretch>
                       <a:fillRect/>
                     </a:stretch>
@@ -23102,9 +23099,7 @@
                       <a:off x="0" y="0"/>
                       <a:ext cx="9235440" cy="3783192"/>
                     </a:xfrm>
-                    <a:prstGeom prst="rect">
-                      <a:avLst/>
-                    </a:prstGeom>
+                    <a:prstGeom prst="rect"/>
                   </pic:spPr>
                 </pic:pic>
               </a:graphicData>
@@ -23122,7 +23117,7 @@
         <w:rPr>
           <w:i/>
         </w:rPr>
-        <w:t>Figure 12. Service and Repository Layers Class Diagram of LegacyVault</w:t>
+        <w:t xml:space="preserve">Figure 12. Service and Repository Layers Class Diagram of LegacyVault</w:t>
       </w:r>
     </w:p>
     <w:p>
@@ -23151,7 +23146,7 @@
       <w:r>
         <w:drawing>
           <wp:inline distT="0" distB="0" distL="114300" distR="114300">
-            <wp:extent cx="7027545" cy="4949825"/>
+            <wp:extent cx="7028159" cy="4950000"/>
             <wp:effectExtent l="0" t="0" r="11430" b="0"/>
             <wp:docPr id="13" name="Picture 13"/>
             <wp:cNvGraphicFramePr>
@@ -23197,7 +23192,7 @@
         <w:rPr>
           <w:i/>
         </w:rPr>
-        <w:t>Figure 13. Conceptual Diagram of LegacyVault</w:t>
+        <w:t xml:space="preserve">Figure 13. Conceptual Diagram of LegacyVault</w:t>
       </w:r>
     </w:p>
     <w:p>
@@ -23243,7 +23238,7 @@
                     </pic:cNvPicPr>
                   </pic:nvPicPr>
                   <pic:blipFill>
-                    <a:blip r:embed="rId19"/>
+                    <a:blip r:embed="rId18"/>
                     <a:stretch>
                       <a:fillRect/>
                     </a:stretch>
@@ -23273,7 +23268,7 @@
         <w:rPr>
           <w:i/>
         </w:rPr>
-        <w:t>Figure 14. Logical Database Diagram of LegacyVault</w:t>
+        <w:t xml:space="preserve">Figure 14. Logical Database Diagram of LegacyVault</w:t>
       </w:r>
     </w:p>
     <w:sectPr>
@@ -23516,8 +23511,8 @@
     <w:lsdException w:uiPriority="99" w:name="index 7"/>
     <w:lsdException w:uiPriority="99" w:name="index 8"/>
     <w:lsdException w:uiPriority="99" w:name="index 9"/>
-    <w:lsdException w:qFormat="1" w:uiPriority="39" w:semiHidden="0" w:name="toc 1"/>
-    <w:lsdException w:qFormat="1" w:uiPriority="39" w:semiHidden="0" w:name="toc 2"/>
+    <w:lsdException w:uiPriority="39" w:semiHidden="0" w:name="toc 1"/>
+    <w:lsdException w:uiPriority="39" w:semiHidden="0" w:name="toc 2"/>
     <w:lsdException w:uiPriority="39" w:semiHidden="0" w:name="toc 3"/>
     <w:lsdException w:uiPriority="39" w:name="toc 4"/>
     <w:lsdException w:uiPriority="39" w:name="toc 5"/>
@@ -23544,7 +23539,7 @@
     <w:lsdException w:uiPriority="99" w:name="table of authorities"/>
     <w:lsdException w:uiPriority="99" w:name="macro"/>
     <w:lsdException w:uiPriority="99" w:name="toa heading"/>
-    <w:lsdException w:qFormat="1" w:unhideWhenUsed="0" w:uiPriority="0" w:name="List"/>
+    <w:lsdException w:unhideWhenUsed="0" w:uiPriority="0" w:name="List"/>
     <w:lsdException w:uiPriority="99" w:name="List Bullet"/>
     <w:lsdException w:uiPriority="99" w:name="List Number"/>
     <w:lsdException w:uiPriority="99" w:name="List 2"/>
@@ -23563,7 +23558,7 @@
     <w:lsdException w:uiPriority="99" w:name="Closing"/>
     <w:lsdException w:uiPriority="99" w:name="Signature"/>
     <w:lsdException w:qFormat="1" w:uiPriority="1" w:name="Default Paragraph Font"/>
-    <w:lsdException w:qFormat="1" w:unhideWhenUsed="0" w:uiPriority="0" w:semiHidden="0" w:name="Body Text"/>
+    <w:lsdException w:unhideWhenUsed="0" w:uiPriority="0" w:semiHidden="0" w:name="Body Text"/>
     <w:lsdException w:uiPriority="99" w:name="Body Text Indent"/>
     <w:lsdException w:uiPriority="99" w:name="List Continue"/>
     <w:lsdException w:uiPriority="99" w:name="List Continue 2"/>
@@ -23600,7 +23595,7 @@
     <w:lsdException w:uiPriority="99" w:name="HTML Sample"/>
     <w:lsdException w:uiPriority="99" w:name="HTML Typewriter"/>
     <w:lsdException w:uiPriority="99" w:name="HTML Variable"/>
-    <w:lsdException w:qFormat="1" w:uiPriority="99" w:name="Normal Table"/>
+    <w:lsdException w:uiPriority="99" w:name="Normal Table"/>
     <w:lsdException w:uiPriority="99" w:name="annotation subject"/>
     <w:lsdException w:uiPriority="99" w:name="Table Simple 1"/>
     <w:lsdException w:uiPriority="99" w:name="Table Simple 2"/>
@@ -23645,7 +23640,7 @@
     <w:lsdException w:uiPriority="99" w:name="Table Web 2"/>
     <w:lsdException w:uiPriority="99" w:name="Table Web 3"/>
     <w:lsdException w:uiPriority="99" w:name="Balloon Text"/>
-    <w:lsdException w:qFormat="1" w:unhideWhenUsed="0" w:uiPriority="0" w:semiHidden="0" w:name="Table Grid"/>
+    <w:lsdException w:unhideWhenUsed="0" w:uiPriority="0" w:semiHidden="0" w:name="Table Grid"/>
     <w:lsdException w:uiPriority="99" w:name="Table Theme"/>
     <w:lsdException w:qFormat="1" w:unhideWhenUsed="0" w:uiPriority="1" w:semiHidden="0" w:name="No Spacing"/>
     <w:lsdException w:unhideWhenUsed="0" w:uiPriority="60" w:semiHidden="0" w:name="Light Shading"/>
@@ -23872,7 +23867,6 @@
     <w:name w:val="Normal Table"/>
     <w:semiHidden/>
     <w:unhideWhenUsed/>
-    <w:qFormat/>
     <w:uiPriority w:val="99"/>
     <w:tblPr>
       <w:tblCellMar>
@@ -23893,7 +23887,6 @@
     <w:name w:val="Body Text"/>
     <w:basedOn w:val="1"/>
     <w:link w:val="28"/>
-    <w:qFormat/>
     <w:uiPriority w:val="0"/>
     <w:pPr>
       <w:spacing w:before="0" w:after="120" w:line="220" w:lineRule="exact"/>
@@ -23952,7 +23945,6 @@
     <w:name w:val="List"/>
     <w:basedOn w:val="1"/>
     <w:semiHidden/>
-    <w:qFormat/>
     <w:uiPriority w:val="0"/>
     <w:pPr>
       <w:spacing w:before="0" w:after="120" w:line="240" w:lineRule="exact"/>
@@ -23975,7 +23967,6 @@
   <w:style w:type="table" w:styleId="15">
     <w:name w:val="Table Grid"/>
     <w:basedOn w:val="8"/>
-    <w:qFormat/>
     <w:uiPriority w:val="0"/>
     <w:pPr>
       <w:spacing w:after="0" w:line="240" w:lineRule="auto"/>
@@ -23997,7 +23988,6 @@
     <w:next w:val="1"/>
     <w:autoRedefine/>
     <w:unhideWhenUsed/>
-    <w:qFormat/>
     <w:uiPriority w:val="39"/>
     <w:pPr>
       <w:spacing w:before="0" w:after="100"/>
@@ -24009,7 +23999,6 @@
     <w:next w:val="1"/>
     <w:autoRedefine/>
     <w:unhideWhenUsed/>
-    <w:qFormat/>
     <w:uiPriority w:val="39"/>
     <w:pPr>
       <w:spacing w:before="0" w:after="100"/>
@@ -24315,7 +24304,6 @@
   <w:style w:type="table" w:customStyle="1" w:styleId="39">
     <w:name w:val="Kiểu2"/>
     <w:basedOn w:val="8"/>
-    <w:qFormat/>
     <w:uiPriority w:val="99"/>
     <w:pPr>
       <w:spacing w:after="0" w:line="240" w:lineRule="auto"/>

</xml_diff>